<commit_message>
Hora Santa de outubro: bênção (padre ou diácono) ou reposição pelo ministro
Co-Authored-By: Claude Opus 5.5 <noreply@anthropic.com>
</commit_message>
<xml_diff>
--- a/2026-10-02/folheto.docx
+++ b/2026-10-02/folheto.docx
@@ -136,7 +136,7 @@
         <w:t xml:space="preserve">19h20  </w:t>
       </w:r>
       <w:r>
-        <w:t>Reposição do Santíssimo</w:t>
+        <w:t>Bênção (padre ou diácono) e reposição do Santíssimo</w:t>
       </w:r>
     </w:p>
     <w:p>
@@ -1486,7 +1486,15 @@
         <w:pStyle w:val="Heading1"/>
       </w:pPr>
       <w:r>
-        <w:t>19h20 · Reposição do Santíssimo</w:t>
+        <w:t>19h20 · Bênção e reposição do Santíssimo</w:t>
+      </w:r>
+    </w:p>
+    <w:p>
+      <w:pPr>
+        <w:pStyle w:val="Heading2"/>
+      </w:pPr>
+      <w:r>
+        <w:t>Com padre ou diácono</w:t>
       </w:r>
     </w:p>
     <w:p>
@@ -1497,7 +1505,26 @@
           <w:color w:val="8F1D21"/>
           <w:sz w:val="19"/>
         </w:rPr>
-        <w:t>O ministro repõe o Santíssimo Sacramento no sacrário, sem bênção, enquanto todos cantam uma aclamação ou um canto eucarístico. A exposição termina antes da Missa (cân. 941 § 2).</w:t>
+        <w:t>O sacerdote ou diácono se aproxima do altar, faz a Adoração ao Santíssimo Sacramento e dá a bênção com o Santíssimo Sacramento.</w:t>
+      </w:r>
+    </w:p>
+    <w:p>
+      <w:pPr>
+        <w:pStyle w:val="Heading2"/>
+      </w:pPr>
+      <w:r>
+        <w:t>Na ausência de padre ou diácono</w:t>
+      </w:r>
+    </w:p>
+    <w:p>
+      <w:r>
+        <w:rPr>
+          <w:b w:val="0"/>
+          <w:i/>
+          <w:color w:val="8F1D21"/>
+          <w:sz w:val="19"/>
+        </w:rPr>
+        <w:t>O ministro repõe o Santíssimo Sacramento no sacrário, sem bênção (cân. 943), enquanto todos cantam uma aclamação ou um canto eucarístico.</w:t>
       </w:r>
     </w:p>
     <w:p>
@@ -1517,6 +1544,14 @@
       </w:r>
     </w:p>
     <w:p>
+      <w:pPr>
+        <w:pStyle w:val="Heading2"/>
+      </w:pPr>
+      <w:r>
+        <w:t>Canto final</w:t>
+      </w:r>
+    </w:p>
+    <w:p>
       <w:r>
         <w:rPr>
           <w:b w:val="0"/>
@@ -1524,7 +1559,7 @@
           <w:color w:val="8F1D21"/>
           <w:sz w:val="19"/>
         </w:rPr>
-        <w:t>Canto a Nossa Senhora, se houver tempo.</w:t>
+        <w:t>Canto a Nossa Senhora, se houver tempo. A exposição termina antes da Missa (cân. 941 § 2).</w:t>
       </w:r>
     </w:p>
     <w:p>

</xml_diff>